<commit_message>
docs: add 3-person task assignment and file ownership matrix
</commit_message>
<xml_diff>
--- a/docs/TAI_LIEU_HUONG_DAN_COLLABORATOR_FULL.docx
+++ b/docs/TAI_LIEU_HUONG_DAN_COLLABORATOR_FULL.docx
@@ -4166,7 +4166,7 @@
           <w:color w:val="000000"/>
           <w:sz w:val="32"/>
         </w:rPr>
-        <w:t>4. HƯỚNG DẪN TRIỂN KHAI TỪNG FILE &amp; PHÂN CÔNG COLLABORATOR</w:t>
+        <w:t>4. HƯỚNG DẪN TRIỂN KHAI TỪNG FILE &amp; PHÂN CÔNG COLLABORATOR (NHÓM 3 NGƯỜI)</w:t>
       </w:r>
     </w:p>
     <w:p>
@@ -4182,7 +4182,2722 @@
           <w:color w:val="000000"/>
           <w:sz w:val="26"/>
         </w:rPr>
-        <w:t>Để đảm bảo tiến độ và không bị xung đột mã nguồn (merge conflict), dự án được phân chia thành 6 Phase rõ ràng. Mỗi collaborator mở đúng file được phân công để làm việc:</w:t>
+        <w:t>Để đảm bảo tiến độ và không bị xung đột mã nguồn (merge conflict), dự án được phân chia độc lập giữa 3 thành viên (Bao gồm: Thành viên 1 - Bạn/Lead, Thành viên 2 - Collaborator A/Frontend, Thành viên 3 - Collaborator B/Backend &amp; Security). Mỗi thành viên chịu trách nhiệm trọn vẹn trên các file riêng biệt:</w:t>
+      </w:r>
+    </w:p>
+    <w:p>
+      <w:pPr>
+        <w:spacing w:line="360" w:lineRule="auto" w:before="200" w:after="80"/>
+      </w:pPr>
+      <w:r>
+        <w:rPr>
+          <w:rFonts w:ascii="Times New Roman" w:hAnsi="Times New Roman"/>
+          <w:b/>
+          <w:color w:val="000000"/>
+          <w:sz w:val="28"/>
+        </w:rPr>
+        <w:t>4.1. Bảng Phân Bổ Vai Trò &amp; Điểm Barem Nhóm 3 Người</w:t>
+      </w:r>
+    </w:p>
+    <w:tbl>
+      <w:tblPr>
+        <w:tblW w:type="auto" w:w="0"/>
+        <w:jc w:val="center"/>
+        <w:tblLayout w:type="fixed"/>
+        <w:tblLook w:firstColumn="1" w:firstRow="1" w:lastColumn="0" w:lastRow="0" w:noHBand="0" w:noVBand="1" w:val="04A0"/>
+      </w:tblPr>
+      <w:tblGrid>
+        <w:gridCol w:w="2351"/>
+        <w:gridCol w:w="2351"/>
+        <w:gridCol w:w="2351"/>
+        <w:gridCol w:w="2351"/>
+      </w:tblGrid>
+      <w:tr>
+        <w:tc>
+          <w:tcPr>
+            <w:tcW w:type="dxa" w:w="2351"/>
+            <w:shd w:val="clear" w:color="auto" w:fill="D9D9D9"/>
+          </w:tcPr>
+          <w:p>
+            <w:pPr>
+              <w:spacing w:line="360" w:lineRule="auto"/>
+              <w:jc w:val="center"/>
+            </w:pPr>
+            <w:r>
+              <w:rPr>
+                <w:rFonts w:ascii="Times New Roman" w:hAnsi="Times New Roman"/>
+                <w:b/>
+                <w:color w:val="000000"/>
+                <w:sz w:val="22"/>
+              </w:rPr>
+              <w:t>Thành Viên</w:t>
+            </w:r>
+          </w:p>
+        </w:tc>
+        <w:tc>
+          <w:tcPr>
+            <w:tcW w:type="dxa" w:w="2351"/>
+            <w:shd w:val="clear" w:color="auto" w:fill="D9D9D9"/>
+          </w:tcPr>
+          <w:p>
+            <w:pPr>
+              <w:spacing w:line="360" w:lineRule="auto"/>
+              <w:jc w:val="center"/>
+            </w:pPr>
+            <w:r>
+              <w:rPr>
+                <w:rFonts w:ascii="Times New Roman" w:hAnsi="Times New Roman"/>
+                <w:b/>
+                <w:color w:val="000000"/>
+                <w:sz w:val="22"/>
+              </w:rPr>
+              <w:t>Vai Trò Chính</w:t>
+            </w:r>
+          </w:p>
+        </w:tc>
+        <w:tc>
+          <w:tcPr>
+            <w:tcW w:type="dxa" w:w="2351"/>
+            <w:shd w:val="clear" w:color="auto" w:fill="D9D9D9"/>
+          </w:tcPr>
+          <w:p>
+            <w:pPr>
+              <w:spacing w:line="360" w:lineRule="auto"/>
+              <w:jc w:val="center"/>
+            </w:pPr>
+            <w:r>
+              <w:rPr>
+                <w:rFonts w:ascii="Times New Roman" w:hAnsi="Times New Roman"/>
+                <w:b/>
+                <w:color w:val="000000"/>
+                <w:sz w:val="22"/>
+              </w:rPr>
+              <w:t>Trọng Tâm Trách Nhiệm</w:t>
+            </w:r>
+          </w:p>
+        </w:tc>
+        <w:tc>
+          <w:tcPr>
+            <w:tcW w:type="dxa" w:w="2351"/>
+            <w:shd w:val="clear" w:color="auto" w:fill="D9D9D9"/>
+          </w:tcPr>
+          <w:p>
+            <w:pPr>
+              <w:spacing w:line="360" w:lineRule="auto"/>
+              <w:jc w:val="center"/>
+            </w:pPr>
+            <w:r>
+              <w:rPr>
+                <w:rFonts w:ascii="Times New Roman" w:hAnsi="Times New Roman"/>
+                <w:b/>
+                <w:color w:val="000000"/>
+                <w:sz w:val="22"/>
+              </w:rPr>
+              <w:t>Barem Phụ Trách</w:t>
+            </w:r>
+          </w:p>
+        </w:tc>
+      </w:tr>
+      <w:tr>
+        <w:tc>
+          <w:tcPr>
+            <w:tcW w:type="dxa" w:w="2351"/>
+          </w:tcPr>
+          <w:p>
+            <w:pPr>
+              <w:spacing w:line="288" w:lineRule="auto" w:after="40"/>
+              <w:jc w:val="center"/>
+            </w:pPr>
+            <w:r>
+              <w:rPr>
+                <w:rFonts w:ascii="Times New Roman" w:hAnsi="Times New Roman"/>
+                <w:b/>
+                <w:color w:val="000000"/>
+                <w:sz w:val="21"/>
+              </w:rPr>
+              <w:t>Thành viên 1 (Bạn)</w:t>
+            </w:r>
+          </w:p>
+        </w:tc>
+        <w:tc>
+          <w:tcPr>
+            <w:tcW w:type="dxa" w:w="2351"/>
+          </w:tcPr>
+          <w:p>
+            <w:pPr>
+              <w:spacing w:line="288" w:lineRule="auto" w:after="40"/>
+              <w:jc w:val="center"/>
+            </w:pPr>
+            <w:r>
+              <w:rPr>
+                <w:rFonts w:ascii="Times New Roman" w:hAnsi="Times New Roman"/>
+                <w:b/>
+                <w:color w:val="000000"/>
+                <w:sz w:val="21"/>
+              </w:rPr>
+              <w:t>Team Leader &amp; Fullstack Architect</w:t>
+            </w:r>
+          </w:p>
+        </w:tc>
+        <w:tc>
+          <w:tcPr>
+            <w:tcW w:type="dxa" w:w="2351"/>
+          </w:tcPr>
+          <w:p>
+            <w:pPr>
+              <w:spacing w:line="288" w:lineRule="auto" w:after="40"/>
+            </w:pPr>
+            <w:r>
+              <w:rPr>
+                <w:rFonts w:ascii="Times New Roman" w:hAnsi="Times New Roman"/>
+                <w:color w:val="000000"/>
+                <w:sz w:val="21"/>
+              </w:rPr>
+              <w:t>CSDL SQL Server, Kiến trúc Base Backend &amp; Mobile, Sơ đồ Bàn ăn, Đồng bộ Offline SQLite, Tích hợp &amp; Review code</w:t>
+            </w:r>
+          </w:p>
+        </w:tc>
+        <w:tc>
+          <w:tcPr>
+            <w:tcW w:type="dxa" w:w="2351"/>
+          </w:tcPr>
+          <w:p>
+            <w:pPr>
+              <w:spacing w:line="288" w:lineRule="auto" w:after="40"/>
+              <w:jc w:val="center"/>
+            </w:pPr>
+            <w:r>
+              <w:rPr>
+                <w:rFonts w:ascii="Times New Roman" w:hAnsi="Times New Roman"/>
+                <w:color w:val="000000"/>
+                <w:sz w:val="21"/>
+              </w:rPr>
+              <w:t>Toàn bộ hệ thống + 2.5đ mở rộng</w:t>
+            </w:r>
+          </w:p>
+        </w:tc>
+      </w:tr>
+      <w:tr>
+        <w:tc>
+          <w:tcPr>
+            <w:tcW w:type="dxa" w:w="2351"/>
+          </w:tcPr>
+          <w:p>
+            <w:pPr>
+              <w:spacing w:line="288" w:lineRule="auto" w:after="40"/>
+              <w:jc w:val="center"/>
+            </w:pPr>
+            <w:r>
+              <w:rPr>
+                <w:rFonts w:ascii="Times New Roman" w:hAnsi="Times New Roman"/>
+                <w:b/>
+                <w:color w:val="000000"/>
+                <w:sz w:val="21"/>
+              </w:rPr>
+              <w:t>Thành viên 2 (Collab A)</w:t>
+            </w:r>
+          </w:p>
+        </w:tc>
+        <w:tc>
+          <w:tcPr>
+            <w:tcW w:type="dxa" w:w="2351"/>
+          </w:tcPr>
+          <w:p>
+            <w:pPr>
+              <w:spacing w:line="288" w:lineRule="auto" w:after="40"/>
+              <w:jc w:val="center"/>
+            </w:pPr>
+            <w:r>
+              <w:rPr>
+                <w:rFonts w:ascii="Times New Roman" w:hAnsi="Times New Roman"/>
+                <w:b/>
+                <w:color w:val="000000"/>
+                <w:sz w:val="21"/>
+              </w:rPr>
+              <w:t>Frontend &amp; Catalog Specialist</w:t>
+            </w:r>
+          </w:p>
+        </w:tc>
+        <w:tc>
+          <w:tcPr>
+            <w:tcW w:type="dxa" w:w="2351"/>
+          </w:tcPr>
+          <w:p>
+            <w:pPr>
+              <w:spacing w:line="288" w:lineRule="auto" w:after="40"/>
+            </w:pPr>
+            <w:r>
+              <w:rPr>
+                <w:rFonts w:ascii="Times New Roman" w:hAnsi="Times New Roman"/>
+                <w:color w:val="000000"/>
+                <w:sz w:val="21"/>
+              </w:rPr>
+              <w:t>UI/UX Trang chủ, Quản trị Danh mục, Sản phẩm phân trang, Upload/Xóa ảnh wwwroot, Giỏ hàng SQLite trên điện thoại</w:t>
+            </w:r>
+          </w:p>
+        </w:tc>
+        <w:tc>
+          <w:tcPr>
+            <w:tcW w:type="dxa" w:w="2351"/>
+          </w:tcPr>
+          <w:p>
+            <w:pPr>
+              <w:spacing w:line="288" w:lineRule="auto" w:after="40"/>
+              <w:jc w:val="center"/>
+            </w:pPr>
+            <w:r>
+              <w:rPr>
+                <w:rFonts w:ascii="Times New Roman" w:hAnsi="Times New Roman"/>
+                <w:color w:val="000000"/>
+                <w:sz w:val="21"/>
+              </w:rPr>
+              <w:t>6.50 điểm (Nhóm 2, 3, 4, 5)</w:t>
+            </w:r>
+          </w:p>
+        </w:tc>
+      </w:tr>
+      <w:tr>
+        <w:tc>
+          <w:tcPr>
+            <w:tcW w:type="dxa" w:w="2351"/>
+          </w:tcPr>
+          <w:p>
+            <w:pPr>
+              <w:spacing w:line="288" w:lineRule="auto" w:after="40"/>
+              <w:jc w:val="center"/>
+            </w:pPr>
+            <w:r>
+              <w:rPr>
+                <w:rFonts w:ascii="Times New Roman" w:hAnsi="Times New Roman"/>
+                <w:b/>
+                <w:color w:val="000000"/>
+                <w:sz w:val="21"/>
+              </w:rPr>
+              <w:t>Thành viên 3 (Collab B)</w:t>
+            </w:r>
+          </w:p>
+        </w:tc>
+        <w:tc>
+          <w:tcPr>
+            <w:tcW w:type="dxa" w:w="2351"/>
+          </w:tcPr>
+          <w:p>
+            <w:pPr>
+              <w:spacing w:line="288" w:lineRule="auto" w:after="40"/>
+              <w:jc w:val="center"/>
+            </w:pPr>
+            <w:r>
+              <w:rPr>
+                <w:rFonts w:ascii="Times New Roman" w:hAnsi="Times New Roman"/>
+                <w:b/>
+                <w:color w:val="000000"/>
+                <w:sz w:val="21"/>
+              </w:rPr>
+              <w:t>Backend &amp; Security Specialist</w:t>
+            </w:r>
+          </w:p>
+        </w:tc>
+        <w:tc>
+          <w:tcPr>
+            <w:tcW w:type="dxa" w:w="2351"/>
+          </w:tcPr>
+          <w:p>
+            <w:pPr>
+              <w:spacing w:line="288" w:lineRule="auto" w:after="40"/>
+            </w:pPr>
+            <w:r>
+              <w:rPr>
+                <w:rFonts w:ascii="Times New Roman" w:hAnsi="Times New Roman"/>
+                <w:color w:val="000000"/>
+                <w:sz w:val="21"/>
+              </w:rPr>
+              <w:t>Xác thực tài khoản (Auth/RBAC), Quản lý đơn hàng Admin, Tích hợp thanh toán VietQR &amp; VNPay, Màn hình Bếp KDS</w:t>
+            </w:r>
+          </w:p>
+        </w:tc>
+        <w:tc>
+          <w:tcPr>
+            <w:tcW w:type="dxa" w:w="2351"/>
+          </w:tcPr>
+          <w:p>
+            <w:pPr>
+              <w:spacing w:line="288" w:lineRule="auto" w:after="40"/>
+              <w:jc w:val="center"/>
+            </w:pPr>
+            <w:r>
+              <w:rPr>
+                <w:rFonts w:ascii="Times New Roman" w:hAnsi="Times New Roman"/>
+                <w:color w:val="000000"/>
+                <w:sz w:val="21"/>
+              </w:rPr>
+              <w:t>6.50 điểm (Nhóm 1, 6 + Thanh toán, KDS)</w:t>
+            </w:r>
+          </w:p>
+        </w:tc>
+      </w:tr>
+    </w:tbl>
+    <w:p>
+      <w:pPr>
+        <w:spacing w:line="360" w:lineRule="auto" w:after="120"/>
+        <w:jc w:val="both"/>
+      </w:pPr>
+      <w:r>
+        <w:rPr>
+          <w:rFonts w:ascii="Times New Roman" w:hAnsi="Times New Roman"/>
+          <w:b w:val="0"/>
+          <w:i w:val="0"/>
+          <w:color w:val="000000"/>
+          <w:sz w:val="26"/>
+        </w:rPr>
+      </w:r>
+    </w:p>
+    <w:p>
+      <w:pPr>
+        <w:spacing w:line="360" w:lineRule="auto" w:before="200" w:after="80"/>
+      </w:pPr>
+      <w:r>
+        <w:rPr>
+          <w:rFonts w:ascii="Times New Roman" w:hAnsi="Times New Roman"/>
+          <w:b/>
+          <w:color w:val="000000"/>
+          <w:sz w:val="28"/>
+        </w:rPr>
+        <w:t>4.2. Ma Trận Sở Hữu File Mã Nguồn (Phòng Tránh Xung Đột Git)</w:t>
+      </w:r>
+    </w:p>
+    <w:tbl>
+      <w:tblPr>
+        <w:tblW w:type="auto" w:w="0"/>
+        <w:jc w:val="center"/>
+        <w:tblLayout w:type="fixed"/>
+        <w:tblLook w:firstColumn="1" w:firstRow="1" w:lastColumn="0" w:lastRow="0" w:noHBand="0" w:noVBand="1" w:val="04A0"/>
+      </w:tblPr>
+      <w:tblGrid>
+        <w:gridCol w:w="2351"/>
+        <w:gridCol w:w="2351"/>
+        <w:gridCol w:w="2351"/>
+        <w:gridCol w:w="2351"/>
+      </w:tblGrid>
+      <w:tr>
+        <w:tc>
+          <w:tcPr>
+            <w:tcW w:type="dxa" w:w="2351"/>
+            <w:shd w:val="clear" w:color="auto" w:fill="D9D9D9"/>
+          </w:tcPr>
+          <w:p>
+            <w:pPr>
+              <w:spacing w:line="360" w:lineRule="auto"/>
+              <w:jc w:val="center"/>
+            </w:pPr>
+            <w:r>
+              <w:rPr>
+                <w:rFonts w:ascii="Times New Roman" w:hAnsi="Times New Roman"/>
+                <w:b/>
+                <w:color w:val="000000"/>
+                <w:sz w:val="22"/>
+              </w:rPr>
+              <w:t>Phân Vùng</w:t>
+            </w:r>
+          </w:p>
+        </w:tc>
+        <w:tc>
+          <w:tcPr>
+            <w:tcW w:type="dxa" w:w="2351"/>
+            <w:shd w:val="clear" w:color="auto" w:fill="D9D9D9"/>
+          </w:tcPr>
+          <w:p>
+            <w:pPr>
+              <w:spacing w:line="360" w:lineRule="auto"/>
+              <w:jc w:val="center"/>
+            </w:pPr>
+            <w:r>
+              <w:rPr>
+                <w:rFonts w:ascii="Times New Roman" w:hAnsi="Times New Roman"/>
+                <w:b/>
+                <w:color w:val="000000"/>
+                <w:sz w:val="22"/>
+              </w:rPr>
+              <w:t>File Mã Nguồn Cụ Thể</w:t>
+            </w:r>
+          </w:p>
+        </w:tc>
+        <w:tc>
+          <w:tcPr>
+            <w:tcW w:type="dxa" w:w="2351"/>
+            <w:shd w:val="clear" w:color="auto" w:fill="D9D9D9"/>
+          </w:tcPr>
+          <w:p>
+            <w:pPr>
+              <w:spacing w:line="360" w:lineRule="auto"/>
+              <w:jc w:val="center"/>
+            </w:pPr>
+            <w:r>
+              <w:rPr>
+                <w:rFonts w:ascii="Times New Roman" w:hAnsi="Times New Roman"/>
+                <w:b/>
+                <w:color w:val="000000"/>
+                <w:sz w:val="22"/>
+              </w:rPr>
+              <w:t>Nhiệm Vụ Triển Khai</w:t>
+            </w:r>
+          </w:p>
+        </w:tc>
+        <w:tc>
+          <w:tcPr>
+            <w:tcW w:type="dxa" w:w="2351"/>
+            <w:shd w:val="clear" w:color="auto" w:fill="D9D9D9"/>
+          </w:tcPr>
+          <w:p>
+            <w:pPr>
+              <w:spacing w:line="360" w:lineRule="auto"/>
+              <w:jc w:val="center"/>
+            </w:pPr>
+            <w:r>
+              <w:rPr>
+                <w:rFonts w:ascii="Times New Roman" w:hAnsi="Times New Roman"/>
+                <w:b/>
+                <w:color w:val="000000"/>
+                <w:sz w:val="22"/>
+              </w:rPr>
+              <w:t>Phụ Trách</w:t>
+            </w:r>
+          </w:p>
+        </w:tc>
+      </w:tr>
+      <w:tr>
+        <w:tc>
+          <w:tcPr>
+            <w:tcW w:type="dxa" w:w="2351"/>
+          </w:tcPr>
+          <w:p>
+            <w:pPr>
+              <w:spacing w:line="288" w:lineRule="auto" w:after="40"/>
+              <w:jc w:val="center"/>
+            </w:pPr>
+            <w:r>
+              <w:rPr>
+                <w:rFonts w:ascii="Times New Roman" w:hAnsi="Times New Roman"/>
+                <w:b/>
+                <w:color w:val="000000"/>
+                <w:sz w:val="20"/>
+              </w:rPr>
+              <w:t>Database</w:t>
+            </w:r>
+          </w:p>
+        </w:tc>
+        <w:tc>
+          <w:tcPr>
+            <w:tcW w:type="dxa" w:w="2351"/>
+          </w:tcPr>
+          <w:p>
+            <w:pPr>
+              <w:spacing w:line="288" w:lineRule="auto" w:after="40"/>
+            </w:pPr>
+            <w:r>
+              <w:rPr>
+                <w:rFonts w:ascii="Times New Roman" w:hAnsi="Times New Roman"/>
+                <w:color w:val="000000"/>
+                <w:sz w:val="20"/>
+              </w:rPr>
+              <w:t>RestaurantPosDb.sql</w:t>
+            </w:r>
+          </w:p>
+        </w:tc>
+        <w:tc>
+          <w:tcPr>
+            <w:tcW w:type="dxa" w:w="2351"/>
+          </w:tcPr>
+          <w:p>
+            <w:pPr>
+              <w:spacing w:line="288" w:lineRule="auto" w:after="40"/>
+            </w:pPr>
+            <w:r>
+              <w:rPr>
+                <w:rFonts w:ascii="Times New Roman" w:hAnsi="Times New Roman"/>
+                <w:color w:val="000000"/>
+                <w:sz w:val="20"/>
+              </w:rPr>
+              <w:t>DDL 10 bảng quan hệ, DML 10 dòng/bảng, Index</w:t>
+            </w:r>
+          </w:p>
+        </w:tc>
+        <w:tc>
+          <w:tcPr>
+            <w:tcW w:type="dxa" w:w="2351"/>
+          </w:tcPr>
+          <w:p>
+            <w:pPr>
+              <w:spacing w:line="288" w:lineRule="auto" w:after="40"/>
+              <w:jc w:val="center"/>
+            </w:pPr>
+            <w:r>
+              <w:rPr>
+                <w:rFonts w:ascii="Times New Roman" w:hAnsi="Times New Roman"/>
+                <w:b/>
+                <w:color w:val="000000"/>
+                <w:sz w:val="20"/>
+              </w:rPr>
+              <w:t>Thành viên 1 (Bạn)</w:t>
+            </w:r>
+          </w:p>
+        </w:tc>
+      </w:tr>
+      <w:tr>
+        <w:tc>
+          <w:tcPr>
+            <w:tcW w:type="dxa" w:w="2351"/>
+          </w:tcPr>
+          <w:p>
+            <w:pPr>
+              <w:spacing w:line="288" w:lineRule="auto" w:after="40"/>
+              <w:jc w:val="center"/>
+            </w:pPr>
+            <w:r>
+              <w:rPr>
+                <w:rFonts w:ascii="Times New Roman" w:hAnsi="Times New Roman"/>
+                <w:b/>
+                <w:color w:val="000000"/>
+                <w:sz w:val="20"/>
+              </w:rPr>
+              <w:t>Backend</w:t>
+            </w:r>
+          </w:p>
+        </w:tc>
+        <w:tc>
+          <w:tcPr>
+            <w:tcW w:type="dxa" w:w="2351"/>
+          </w:tcPr>
+          <w:p>
+            <w:pPr>
+              <w:spacing w:line="288" w:lineRule="auto" w:after="40"/>
+            </w:pPr>
+            <w:r>
+              <w:rPr>
+                <w:rFonts w:ascii="Times New Roman" w:hAnsi="Times New Roman"/>
+                <w:color w:val="000000"/>
+                <w:sz w:val="20"/>
+              </w:rPr>
+              <w:t>RestaurantPosContext.cs</w:t>
+            </w:r>
+          </w:p>
+        </w:tc>
+        <w:tc>
+          <w:tcPr>
+            <w:tcW w:type="dxa" w:w="2351"/>
+          </w:tcPr>
+          <w:p>
+            <w:pPr>
+              <w:spacing w:line="288" w:lineRule="auto" w:after="40"/>
+            </w:pPr>
+            <w:r>
+              <w:rPr>
+                <w:rFonts w:ascii="Times New Roman" w:hAnsi="Times New Roman"/>
+                <w:color w:val="000000"/>
+                <w:sz w:val="20"/>
+              </w:rPr>
+              <w:t>DbContext, 10 DbSet, quan hệ Fluent API</w:t>
+            </w:r>
+          </w:p>
+        </w:tc>
+        <w:tc>
+          <w:tcPr>
+            <w:tcW w:type="dxa" w:w="2351"/>
+          </w:tcPr>
+          <w:p>
+            <w:pPr>
+              <w:spacing w:line="288" w:lineRule="auto" w:after="40"/>
+              <w:jc w:val="center"/>
+            </w:pPr>
+            <w:r>
+              <w:rPr>
+                <w:rFonts w:ascii="Times New Roman" w:hAnsi="Times New Roman"/>
+                <w:b/>
+                <w:color w:val="000000"/>
+                <w:sz w:val="20"/>
+              </w:rPr>
+              <w:t>Thành viên 1 (Bạn)</w:t>
+            </w:r>
+          </w:p>
+        </w:tc>
+      </w:tr>
+      <w:tr>
+        <w:tc>
+          <w:tcPr>
+            <w:tcW w:type="dxa" w:w="2351"/>
+          </w:tcPr>
+          <w:p>
+            <w:pPr>
+              <w:spacing w:line="288" w:lineRule="auto" w:after="40"/>
+              <w:jc w:val="center"/>
+            </w:pPr>
+            <w:r>
+              <w:rPr>
+                <w:rFonts w:ascii="Times New Roman" w:hAnsi="Times New Roman"/>
+                <w:b/>
+                <w:color w:val="000000"/>
+                <w:sz w:val="20"/>
+              </w:rPr>
+              <w:t>Backend</w:t>
+            </w:r>
+          </w:p>
+        </w:tc>
+        <w:tc>
+          <w:tcPr>
+            <w:tcW w:type="dxa" w:w="2351"/>
+          </w:tcPr>
+          <w:p>
+            <w:pPr>
+              <w:spacing w:line="288" w:lineRule="auto" w:after="40"/>
+            </w:pPr>
+            <w:r>
+              <w:rPr>
+                <w:rFonts w:ascii="Times New Roman" w:hAnsi="Times New Roman"/>
+                <w:color w:val="000000"/>
+                <w:sz w:val="20"/>
+              </w:rPr>
+              <w:t>BaseProvider, BaseRepo, SiteProvider</w:t>
+            </w:r>
+          </w:p>
+        </w:tc>
+        <w:tc>
+          <w:tcPr>
+            <w:tcW w:type="dxa" w:w="2351"/>
+          </w:tcPr>
+          <w:p>
+            <w:pPr>
+              <w:spacing w:line="288" w:lineRule="auto" w:after="40"/>
+            </w:pPr>
+            <w:r>
+              <w:rPr>
+                <w:rFonts w:ascii="Times New Roman" w:hAnsi="Times New Roman"/>
+                <w:color w:val="000000"/>
+                <w:sz w:val="20"/>
+              </w:rPr>
+              <w:t>Kiến trúc Facade / Provider chuẩn của thầy</w:t>
+            </w:r>
+          </w:p>
+        </w:tc>
+        <w:tc>
+          <w:tcPr>
+            <w:tcW w:type="dxa" w:w="2351"/>
+          </w:tcPr>
+          <w:p>
+            <w:pPr>
+              <w:spacing w:line="288" w:lineRule="auto" w:after="40"/>
+              <w:jc w:val="center"/>
+            </w:pPr>
+            <w:r>
+              <w:rPr>
+                <w:rFonts w:ascii="Times New Roman" w:hAnsi="Times New Roman"/>
+                <w:b/>
+                <w:color w:val="000000"/>
+                <w:sz w:val="20"/>
+              </w:rPr>
+              <w:t>Thành viên 1 (Bạn)</w:t>
+            </w:r>
+          </w:p>
+        </w:tc>
+      </w:tr>
+      <w:tr>
+        <w:tc>
+          <w:tcPr>
+            <w:tcW w:type="dxa" w:w="2351"/>
+          </w:tcPr>
+          <w:p>
+            <w:pPr>
+              <w:spacing w:line="288" w:lineRule="auto" w:after="40"/>
+              <w:jc w:val="center"/>
+            </w:pPr>
+            <w:r>
+              <w:rPr>
+                <w:rFonts w:ascii="Times New Roman" w:hAnsi="Times New Roman"/>
+                <w:b/>
+                <w:color w:val="000000"/>
+                <w:sz w:val="20"/>
+              </w:rPr>
+              <w:t>Backend</w:t>
+            </w:r>
+          </w:p>
+        </w:tc>
+        <w:tc>
+          <w:tcPr>
+            <w:tcW w:type="dxa" w:w="2351"/>
+          </w:tcPr>
+          <w:p>
+            <w:pPr>
+              <w:spacing w:line="288" w:lineRule="auto" w:after="40"/>
+            </w:pPr>
+            <w:r>
+              <w:rPr>
+                <w:rFonts w:ascii="Times New Roman" w:hAnsi="Times New Roman"/>
+                <w:color w:val="000000"/>
+                <w:sz w:val="20"/>
+              </w:rPr>
+              <w:t>TableController.cs, TableRepository.cs</w:t>
+            </w:r>
+          </w:p>
+        </w:tc>
+        <w:tc>
+          <w:tcPr>
+            <w:tcW w:type="dxa" w:w="2351"/>
+          </w:tcPr>
+          <w:p>
+            <w:pPr>
+              <w:spacing w:line="288" w:lineRule="auto" w:after="40"/>
+            </w:pPr>
+            <w:r>
+              <w:rPr>
+                <w:rFonts w:ascii="Times New Roman" w:hAnsi="Times New Roman"/>
+                <w:color w:val="000000"/>
+                <w:sz w:val="20"/>
+              </w:rPr>
+              <w:t>API sơ đồ bàn ăn, đổi trạng thái bàn, chuyển bàn</w:t>
+            </w:r>
+          </w:p>
+        </w:tc>
+        <w:tc>
+          <w:tcPr>
+            <w:tcW w:type="dxa" w:w="2351"/>
+          </w:tcPr>
+          <w:p>
+            <w:pPr>
+              <w:spacing w:line="288" w:lineRule="auto" w:after="40"/>
+              <w:jc w:val="center"/>
+            </w:pPr>
+            <w:r>
+              <w:rPr>
+                <w:rFonts w:ascii="Times New Roman" w:hAnsi="Times New Roman"/>
+                <w:b/>
+                <w:color w:val="000000"/>
+                <w:sz w:val="20"/>
+              </w:rPr>
+              <w:t>Thành viên 1 (Bạn)</w:t>
+            </w:r>
+          </w:p>
+        </w:tc>
+      </w:tr>
+      <w:tr>
+        <w:tc>
+          <w:tcPr>
+            <w:tcW w:type="dxa" w:w="2351"/>
+          </w:tcPr>
+          <w:p>
+            <w:pPr>
+              <w:spacing w:line="288" w:lineRule="auto" w:after="40"/>
+              <w:jc w:val="center"/>
+            </w:pPr>
+            <w:r>
+              <w:rPr>
+                <w:rFonts w:ascii="Times New Roman" w:hAnsi="Times New Roman"/>
+                <w:b/>
+                <w:color w:val="000000"/>
+                <w:sz w:val="20"/>
+              </w:rPr>
+              <w:t>Backend</w:t>
+            </w:r>
+          </w:p>
+        </w:tc>
+        <w:tc>
+          <w:tcPr>
+            <w:tcW w:type="dxa" w:w="2351"/>
+          </w:tcPr>
+          <w:p>
+            <w:pPr>
+              <w:spacing w:line="288" w:lineRule="auto" w:after="40"/>
+            </w:pPr>
+            <w:r>
+              <w:rPr>
+                <w:rFonts w:ascii="Times New Roman" w:hAnsi="Times New Roman"/>
+                <w:color w:val="000000"/>
+                <w:sz w:val="20"/>
+              </w:rPr>
+              <w:t>Helper.cs (Image processing)</w:t>
+            </w:r>
+          </w:p>
+        </w:tc>
+        <w:tc>
+          <w:tcPr>
+            <w:tcW w:type="dxa" w:w="2351"/>
+          </w:tcPr>
+          <w:p>
+            <w:pPr>
+              <w:spacing w:line="288" w:lineRule="auto" w:after="40"/>
+            </w:pPr>
+            <w:r>
+              <w:rPr>
+                <w:rFonts w:ascii="Times New Roman" w:hAnsi="Times New Roman"/>
+                <w:color w:val="000000"/>
+                <w:sz w:val="20"/>
+              </w:rPr>
+              <w:t>Lưu ảnh vào wwwroot/images và dọn dẹp ảnh cũ</w:t>
+            </w:r>
+          </w:p>
+        </w:tc>
+        <w:tc>
+          <w:tcPr>
+            <w:tcW w:type="dxa" w:w="2351"/>
+          </w:tcPr>
+          <w:p>
+            <w:pPr>
+              <w:spacing w:line="288" w:lineRule="auto" w:after="40"/>
+              <w:jc w:val="center"/>
+            </w:pPr>
+            <w:r>
+              <w:rPr>
+                <w:rFonts w:ascii="Times New Roman" w:hAnsi="Times New Roman"/>
+                <w:b/>
+                <w:color w:val="000000"/>
+                <w:sz w:val="20"/>
+              </w:rPr>
+              <w:t>Thành viên 2 (Collab A)</w:t>
+            </w:r>
+          </w:p>
+        </w:tc>
+      </w:tr>
+      <w:tr>
+        <w:tc>
+          <w:tcPr>
+            <w:tcW w:type="dxa" w:w="2351"/>
+          </w:tcPr>
+          <w:p>
+            <w:pPr>
+              <w:spacing w:line="288" w:lineRule="auto" w:after="40"/>
+              <w:jc w:val="center"/>
+            </w:pPr>
+            <w:r>
+              <w:rPr>
+                <w:rFonts w:ascii="Times New Roman" w:hAnsi="Times New Roman"/>
+                <w:b/>
+                <w:color w:val="000000"/>
+                <w:sz w:val="20"/>
+              </w:rPr>
+              <w:t>Backend</w:t>
+            </w:r>
+          </w:p>
+        </w:tc>
+        <w:tc>
+          <w:tcPr>
+            <w:tcW w:type="dxa" w:w="2351"/>
+          </w:tcPr>
+          <w:p>
+            <w:pPr>
+              <w:spacing w:line="288" w:lineRule="auto" w:after="40"/>
+            </w:pPr>
+            <w:r>
+              <w:rPr>
+                <w:rFonts w:ascii="Times New Roman" w:hAnsi="Times New Roman"/>
+                <w:color w:val="000000"/>
+                <w:sz w:val="20"/>
+              </w:rPr>
+              <w:t>CategoryController.cs, CategoryRepo.cs</w:t>
+            </w:r>
+          </w:p>
+        </w:tc>
+        <w:tc>
+          <w:tcPr>
+            <w:tcW w:type="dxa" w:w="2351"/>
+          </w:tcPr>
+          <w:p>
+            <w:pPr>
+              <w:spacing w:line="288" w:lineRule="auto" w:after="40"/>
+            </w:pPr>
+            <w:r>
+              <w:rPr>
+                <w:rFonts w:ascii="Times New Roman" w:hAnsi="Times New Roman"/>
+                <w:color w:val="000000"/>
+                <w:sz w:val="20"/>
+              </w:rPr>
+              <w:t>API danh mục, kiểm tra HasProducts() chặn xóa</w:t>
+            </w:r>
+          </w:p>
+        </w:tc>
+        <w:tc>
+          <w:tcPr>
+            <w:tcW w:type="dxa" w:w="2351"/>
+          </w:tcPr>
+          <w:p>
+            <w:pPr>
+              <w:spacing w:line="288" w:lineRule="auto" w:after="40"/>
+              <w:jc w:val="center"/>
+            </w:pPr>
+            <w:r>
+              <w:rPr>
+                <w:rFonts w:ascii="Times New Roman" w:hAnsi="Times New Roman"/>
+                <w:b/>
+                <w:color w:val="000000"/>
+                <w:sz w:val="20"/>
+              </w:rPr>
+              <w:t>Thành viên 2 (Collab A)</w:t>
+            </w:r>
+          </w:p>
+        </w:tc>
+      </w:tr>
+      <w:tr>
+        <w:tc>
+          <w:tcPr>
+            <w:tcW w:type="dxa" w:w="2351"/>
+          </w:tcPr>
+          <w:p>
+            <w:pPr>
+              <w:spacing w:line="288" w:lineRule="auto" w:after="40"/>
+              <w:jc w:val="center"/>
+            </w:pPr>
+            <w:r>
+              <w:rPr>
+                <w:rFonts w:ascii="Times New Roman" w:hAnsi="Times New Roman"/>
+                <w:b/>
+                <w:color w:val="000000"/>
+                <w:sz w:val="20"/>
+              </w:rPr>
+              <w:t>Backend</w:t>
+            </w:r>
+          </w:p>
+        </w:tc>
+        <w:tc>
+          <w:tcPr>
+            <w:tcW w:type="dxa" w:w="2351"/>
+          </w:tcPr>
+          <w:p>
+            <w:pPr>
+              <w:spacing w:line="288" w:lineRule="auto" w:after="40"/>
+            </w:pPr>
+            <w:r>
+              <w:rPr>
+                <w:rFonts w:ascii="Times New Roman" w:hAnsi="Times New Roman"/>
+                <w:color w:val="000000"/>
+                <w:sz w:val="20"/>
+              </w:rPr>
+              <w:t>ProductController.cs, ProductRepo.cs</w:t>
+            </w:r>
+          </w:p>
+        </w:tc>
+        <w:tc>
+          <w:tcPr>
+            <w:tcW w:type="dxa" w:w="2351"/>
+          </w:tcPr>
+          <w:p>
+            <w:pPr>
+              <w:spacing w:line="288" w:lineRule="auto" w:after="40"/>
+            </w:pPr>
+            <w:r>
+              <w:rPr>
+                <w:rFonts w:ascii="Times New Roman" w:hAnsi="Times New Roman"/>
+                <w:color w:val="000000"/>
+                <w:sz w:val="20"/>
+              </w:rPr>
+              <w:t>API sản phẩm phân trang, kiểm tra HasOrders() chặn xóa</w:t>
+            </w:r>
+          </w:p>
+        </w:tc>
+        <w:tc>
+          <w:tcPr>
+            <w:tcW w:type="dxa" w:w="2351"/>
+          </w:tcPr>
+          <w:p>
+            <w:pPr>
+              <w:spacing w:line="288" w:lineRule="auto" w:after="40"/>
+              <w:jc w:val="center"/>
+            </w:pPr>
+            <w:r>
+              <w:rPr>
+                <w:rFonts w:ascii="Times New Roman" w:hAnsi="Times New Roman"/>
+                <w:b/>
+                <w:color w:val="000000"/>
+                <w:sz w:val="20"/>
+              </w:rPr>
+              <w:t>Thành viên 2 (Collab A)</w:t>
+            </w:r>
+          </w:p>
+        </w:tc>
+      </w:tr>
+      <w:tr>
+        <w:tc>
+          <w:tcPr>
+            <w:tcW w:type="dxa" w:w="2351"/>
+          </w:tcPr>
+          <w:p>
+            <w:pPr>
+              <w:spacing w:line="288" w:lineRule="auto" w:after="40"/>
+              <w:jc w:val="center"/>
+            </w:pPr>
+            <w:r>
+              <w:rPr>
+                <w:rFonts w:ascii="Times New Roman" w:hAnsi="Times New Roman"/>
+                <w:b/>
+                <w:color w:val="000000"/>
+                <w:sz w:val="20"/>
+              </w:rPr>
+              <w:t>Backend</w:t>
+            </w:r>
+          </w:p>
+        </w:tc>
+        <w:tc>
+          <w:tcPr>
+            <w:tcW w:type="dxa" w:w="2351"/>
+          </w:tcPr>
+          <w:p>
+            <w:pPr>
+              <w:spacing w:line="288" w:lineRule="auto" w:after="40"/>
+            </w:pPr>
+            <w:r>
+              <w:rPr>
+                <w:rFonts w:ascii="Times New Roman" w:hAnsi="Times New Roman"/>
+                <w:color w:val="000000"/>
+                <w:sz w:val="20"/>
+              </w:rPr>
+              <w:t>AuthController.cs, AccountRepo.cs</w:t>
+            </w:r>
+          </w:p>
+        </w:tc>
+        <w:tc>
+          <w:tcPr>
+            <w:tcW w:type="dxa" w:w="2351"/>
+          </w:tcPr>
+          <w:p>
+            <w:pPr>
+              <w:spacing w:line="288" w:lineRule="auto" w:after="40"/>
+            </w:pPr>
+            <w:r>
+              <w:rPr>
+                <w:rFonts w:ascii="Times New Roman" w:hAnsi="Times New Roman"/>
+                <w:color w:val="000000"/>
+                <w:sz w:val="20"/>
+              </w:rPr>
+              <w:t>Đăng ký, đăng nhập băm mật khẩu, đổi MK, OAuth</w:t>
+            </w:r>
+          </w:p>
+        </w:tc>
+        <w:tc>
+          <w:tcPr>
+            <w:tcW w:type="dxa" w:w="2351"/>
+          </w:tcPr>
+          <w:p>
+            <w:pPr>
+              <w:spacing w:line="288" w:lineRule="auto" w:after="40"/>
+              <w:jc w:val="center"/>
+            </w:pPr>
+            <w:r>
+              <w:rPr>
+                <w:rFonts w:ascii="Times New Roman" w:hAnsi="Times New Roman"/>
+                <w:b/>
+                <w:color w:val="000000"/>
+                <w:sz w:val="20"/>
+              </w:rPr>
+              <w:t>Thành viên 3 (Collab B)</w:t>
+            </w:r>
+          </w:p>
+        </w:tc>
+      </w:tr>
+      <w:tr>
+        <w:tc>
+          <w:tcPr>
+            <w:tcW w:type="dxa" w:w="2351"/>
+          </w:tcPr>
+          <w:p>
+            <w:pPr>
+              <w:spacing w:line="288" w:lineRule="auto" w:after="40"/>
+              <w:jc w:val="center"/>
+            </w:pPr>
+            <w:r>
+              <w:rPr>
+                <w:rFonts w:ascii="Times New Roman" w:hAnsi="Times New Roman"/>
+                <w:b/>
+                <w:color w:val="000000"/>
+                <w:sz w:val="20"/>
+              </w:rPr>
+              <w:t>Backend</w:t>
+            </w:r>
+          </w:p>
+        </w:tc>
+        <w:tc>
+          <w:tcPr>
+            <w:tcW w:type="dxa" w:w="2351"/>
+          </w:tcPr>
+          <w:p>
+            <w:pPr>
+              <w:spacing w:line="288" w:lineRule="auto" w:after="40"/>
+            </w:pPr>
+            <w:r>
+              <w:rPr>
+                <w:rFonts w:ascii="Times New Roman" w:hAnsi="Times New Roman"/>
+                <w:color w:val="000000"/>
+                <w:sz w:val="20"/>
+              </w:rPr>
+              <w:t>OrderController.cs, OrderRepo.cs</w:t>
+            </w:r>
+          </w:p>
+        </w:tc>
+        <w:tc>
+          <w:tcPr>
+            <w:tcW w:type="dxa" w:w="2351"/>
+          </w:tcPr>
+          <w:p>
+            <w:pPr>
+              <w:spacing w:line="288" w:lineRule="auto" w:after="40"/>
+            </w:pPr>
+            <w:r>
+              <w:rPr>
+                <w:rFonts w:ascii="Times New Roman" w:hAnsi="Times New Roman"/>
+                <w:color w:val="000000"/>
+                <w:sz w:val="20"/>
+              </w:rPr>
+              <w:t>Tạo đơn Transaction, đổi trạng thái đơn, lọc ngày</w:t>
+            </w:r>
+          </w:p>
+        </w:tc>
+        <w:tc>
+          <w:tcPr>
+            <w:tcW w:type="dxa" w:w="2351"/>
+          </w:tcPr>
+          <w:p>
+            <w:pPr>
+              <w:spacing w:line="288" w:lineRule="auto" w:after="40"/>
+              <w:jc w:val="center"/>
+            </w:pPr>
+            <w:r>
+              <w:rPr>
+                <w:rFonts w:ascii="Times New Roman" w:hAnsi="Times New Roman"/>
+                <w:b/>
+                <w:color w:val="000000"/>
+                <w:sz w:val="20"/>
+              </w:rPr>
+              <w:t>Thành viên 3 (Collab B)</w:t>
+            </w:r>
+          </w:p>
+        </w:tc>
+      </w:tr>
+      <w:tr>
+        <w:tc>
+          <w:tcPr>
+            <w:tcW w:type="dxa" w:w="2351"/>
+          </w:tcPr>
+          <w:p>
+            <w:pPr>
+              <w:spacing w:line="288" w:lineRule="auto" w:after="40"/>
+              <w:jc w:val="center"/>
+            </w:pPr>
+            <w:r>
+              <w:rPr>
+                <w:rFonts w:ascii="Times New Roman" w:hAnsi="Times New Roman"/>
+                <w:b/>
+                <w:color w:val="000000"/>
+                <w:sz w:val="20"/>
+              </w:rPr>
+              <w:t>Backend</w:t>
+            </w:r>
+          </w:p>
+        </w:tc>
+        <w:tc>
+          <w:tcPr>
+            <w:tcW w:type="dxa" w:w="2351"/>
+          </w:tcPr>
+          <w:p>
+            <w:pPr>
+              <w:spacing w:line="288" w:lineRule="auto" w:after="40"/>
+            </w:pPr>
+            <w:r>
+              <w:rPr>
+                <w:rFonts w:ascii="Times New Roman" w:hAnsi="Times New Roman"/>
+                <w:color w:val="000000"/>
+                <w:sz w:val="20"/>
+              </w:rPr>
+              <w:t>PaymentController.cs, PaymentRepo.cs</w:t>
+            </w:r>
+          </w:p>
+        </w:tc>
+        <w:tc>
+          <w:tcPr>
+            <w:tcW w:type="dxa" w:w="2351"/>
+          </w:tcPr>
+          <w:p>
+            <w:pPr>
+              <w:spacing w:line="288" w:lineRule="auto" w:after="40"/>
+            </w:pPr>
+            <w:r>
+              <w:rPr>
+                <w:rFonts w:ascii="Times New Roman" w:hAnsi="Times New Roman"/>
+                <w:color w:val="000000"/>
+                <w:sz w:val="20"/>
+              </w:rPr>
+              <w:t>Tạo mã VietQR động NAPAS 247, URL VNPayment</w:t>
+            </w:r>
+          </w:p>
+        </w:tc>
+        <w:tc>
+          <w:tcPr>
+            <w:tcW w:type="dxa" w:w="2351"/>
+          </w:tcPr>
+          <w:p>
+            <w:pPr>
+              <w:spacing w:line="288" w:lineRule="auto" w:after="40"/>
+              <w:jc w:val="center"/>
+            </w:pPr>
+            <w:r>
+              <w:rPr>
+                <w:rFonts w:ascii="Times New Roman" w:hAnsi="Times New Roman"/>
+                <w:b/>
+                <w:color w:val="000000"/>
+                <w:sz w:val="20"/>
+              </w:rPr>
+              <w:t>Thành viên 3 (Collab B)</w:t>
+            </w:r>
+          </w:p>
+        </w:tc>
+      </w:tr>
+      <w:tr>
+        <w:tc>
+          <w:tcPr>
+            <w:tcW w:type="dxa" w:w="2351"/>
+          </w:tcPr>
+          <w:p>
+            <w:pPr>
+              <w:spacing w:line="288" w:lineRule="auto" w:after="40"/>
+              <w:jc w:val="center"/>
+            </w:pPr>
+            <w:r>
+              <w:rPr>
+                <w:rFonts w:ascii="Times New Roman" w:hAnsi="Times New Roman"/>
+                <w:b/>
+                <w:color w:val="000000"/>
+                <w:sz w:val="20"/>
+              </w:rPr>
+              <w:t>Backend</w:t>
+            </w:r>
+          </w:p>
+        </w:tc>
+        <w:tc>
+          <w:tcPr>
+            <w:tcW w:type="dxa" w:w="2351"/>
+          </w:tcPr>
+          <w:p>
+            <w:pPr>
+              <w:spacing w:line="288" w:lineRule="auto" w:after="40"/>
+            </w:pPr>
+            <w:r>
+              <w:rPr>
+                <w:rFonts w:ascii="Times New Roman" w:hAnsi="Times New Roman"/>
+                <w:color w:val="000000"/>
+                <w:sz w:val="20"/>
+              </w:rPr>
+              <w:t>KdsController.cs</w:t>
+            </w:r>
+          </w:p>
+        </w:tc>
+        <w:tc>
+          <w:tcPr>
+            <w:tcW w:type="dxa" w:w="2351"/>
+          </w:tcPr>
+          <w:p>
+            <w:pPr>
+              <w:spacing w:line="288" w:lineRule="auto" w:after="40"/>
+            </w:pPr>
+            <w:r>
+              <w:rPr>
+                <w:rFonts w:ascii="Times New Roman" w:hAnsi="Times New Roman"/>
+                <w:color w:val="000000"/>
+                <w:sz w:val="20"/>
+              </w:rPr>
+              <w:t>API màn hình bếp (lấy món chờ nấu, CookingStatus)</w:t>
+            </w:r>
+          </w:p>
+        </w:tc>
+        <w:tc>
+          <w:tcPr>
+            <w:tcW w:type="dxa" w:w="2351"/>
+          </w:tcPr>
+          <w:p>
+            <w:pPr>
+              <w:spacing w:line="288" w:lineRule="auto" w:after="40"/>
+              <w:jc w:val="center"/>
+            </w:pPr>
+            <w:r>
+              <w:rPr>
+                <w:rFonts w:ascii="Times New Roman" w:hAnsi="Times New Roman"/>
+                <w:b/>
+                <w:color w:val="000000"/>
+                <w:sz w:val="20"/>
+              </w:rPr>
+              <w:t>Thành viên 3 (Collab B)</w:t>
+            </w:r>
+          </w:p>
+        </w:tc>
+      </w:tr>
+      <w:tr>
+        <w:tc>
+          <w:tcPr>
+            <w:tcW w:type="dxa" w:w="2351"/>
+          </w:tcPr>
+          <w:p>
+            <w:pPr>
+              <w:spacing w:line="288" w:lineRule="auto" w:after="40"/>
+              <w:jc w:val="center"/>
+            </w:pPr>
+            <w:r>
+              <w:rPr>
+                <w:rFonts w:ascii="Times New Roman" w:hAnsi="Times New Roman"/>
+                <w:b/>
+                <w:color w:val="000000"/>
+                <w:sz w:val="20"/>
+              </w:rPr>
+              <w:t>Mobile</w:t>
+            </w:r>
+          </w:p>
+        </w:tc>
+        <w:tc>
+          <w:tcPr>
+            <w:tcW w:type="dxa" w:w="2351"/>
+          </w:tcPr>
+          <w:p>
+            <w:pPr>
+              <w:spacing w:line="288" w:lineRule="auto" w:after="40"/>
+            </w:pPr>
+            <w:r>
+              <w:rPr>
+                <w:rFonts w:ascii="Times New Roman" w:hAnsi="Times New Roman"/>
+                <w:color w:val="000000"/>
+                <w:sz w:val="20"/>
+              </w:rPr>
+              <w:t>utils/database_helper.dart</w:t>
+            </w:r>
+          </w:p>
+        </w:tc>
+        <w:tc>
+          <w:tcPr>
+            <w:tcW w:type="dxa" w:w="2351"/>
+          </w:tcPr>
+          <w:p>
+            <w:pPr>
+              <w:spacing w:line="288" w:lineRule="auto" w:after="40"/>
+            </w:pPr>
+            <w:r>
+              <w:rPr>
+                <w:rFonts w:ascii="Times New Roman" w:hAnsi="Times New Roman"/>
+                <w:color w:val="000000"/>
+                <w:sz w:val="20"/>
+              </w:rPr>
+              <w:t>Singleton SQLite (cart_items, user_session, offline)</w:t>
+            </w:r>
+          </w:p>
+        </w:tc>
+        <w:tc>
+          <w:tcPr>
+            <w:tcW w:type="dxa" w:w="2351"/>
+          </w:tcPr>
+          <w:p>
+            <w:pPr>
+              <w:spacing w:line="288" w:lineRule="auto" w:after="40"/>
+              <w:jc w:val="center"/>
+            </w:pPr>
+            <w:r>
+              <w:rPr>
+                <w:rFonts w:ascii="Times New Roman" w:hAnsi="Times New Roman"/>
+                <w:b/>
+                <w:color w:val="000000"/>
+                <w:sz w:val="20"/>
+              </w:rPr>
+              <w:t>Thành viên 1 (Bạn)</w:t>
+            </w:r>
+          </w:p>
+        </w:tc>
+      </w:tr>
+      <w:tr>
+        <w:tc>
+          <w:tcPr>
+            <w:tcW w:type="dxa" w:w="2351"/>
+          </w:tcPr>
+          <w:p>
+            <w:pPr>
+              <w:spacing w:line="288" w:lineRule="auto" w:after="40"/>
+              <w:jc w:val="center"/>
+            </w:pPr>
+            <w:r>
+              <w:rPr>
+                <w:rFonts w:ascii="Times New Roman" w:hAnsi="Times New Roman"/>
+                <w:b/>
+                <w:color w:val="000000"/>
+                <w:sz w:val="20"/>
+              </w:rPr>
+              <w:t>Mobile</w:t>
+            </w:r>
+          </w:p>
+        </w:tc>
+        <w:tc>
+          <w:tcPr>
+            <w:tcW w:type="dxa" w:w="2351"/>
+          </w:tcPr>
+          <w:p>
+            <w:pPr>
+              <w:spacing w:line="288" w:lineRule="auto" w:after="40"/>
+            </w:pPr>
+            <w:r>
+              <w:rPr>
+                <w:rFonts w:ascii="Times New Roman" w:hAnsi="Times New Roman"/>
+                <w:color w:val="000000"/>
+                <w:sz w:val="20"/>
+              </w:rPr>
+              <w:t>views/table/floor_table_page.dart</w:t>
+            </w:r>
+          </w:p>
+        </w:tc>
+        <w:tc>
+          <w:tcPr>
+            <w:tcW w:type="dxa" w:w="2351"/>
+          </w:tcPr>
+          <w:p>
+            <w:pPr>
+              <w:spacing w:line="288" w:lineRule="auto" w:after="40"/>
+            </w:pPr>
+            <w:r>
+              <w:rPr>
+                <w:rFonts w:ascii="Times New Roman" w:hAnsi="Times New Roman"/>
+                <w:color w:val="000000"/>
+                <w:sz w:val="20"/>
+              </w:rPr>
+              <w:t>Sơ đồ bàn theo khu vực (Trống, Có khách, Đổi bàn)</w:t>
+            </w:r>
+          </w:p>
+        </w:tc>
+        <w:tc>
+          <w:tcPr>
+            <w:tcW w:type="dxa" w:w="2351"/>
+          </w:tcPr>
+          <w:p>
+            <w:pPr>
+              <w:spacing w:line="288" w:lineRule="auto" w:after="40"/>
+              <w:jc w:val="center"/>
+            </w:pPr>
+            <w:r>
+              <w:rPr>
+                <w:rFonts w:ascii="Times New Roman" w:hAnsi="Times New Roman"/>
+                <w:b/>
+                <w:color w:val="000000"/>
+                <w:sz w:val="20"/>
+              </w:rPr>
+              <w:t>Thành viên 1 (Bạn)</w:t>
+            </w:r>
+          </w:p>
+        </w:tc>
+      </w:tr>
+      <w:tr>
+        <w:tc>
+          <w:tcPr>
+            <w:tcW w:type="dxa" w:w="2351"/>
+          </w:tcPr>
+          <w:p>
+            <w:pPr>
+              <w:spacing w:line="288" w:lineRule="auto" w:after="40"/>
+              <w:jc w:val="center"/>
+            </w:pPr>
+            <w:r>
+              <w:rPr>
+                <w:rFonts w:ascii="Times New Roman" w:hAnsi="Times New Roman"/>
+                <w:b/>
+                <w:color w:val="000000"/>
+                <w:sz w:val="20"/>
+              </w:rPr>
+              <w:t>Mobile</w:t>
+            </w:r>
+          </w:p>
+        </w:tc>
+        <w:tc>
+          <w:tcPr>
+            <w:tcW w:type="dxa" w:w="2351"/>
+          </w:tcPr>
+          <w:p>
+            <w:pPr>
+              <w:spacing w:line="288" w:lineRule="auto" w:after="40"/>
+            </w:pPr>
+            <w:r>
+              <w:rPr>
+                <w:rFonts w:ascii="Times New Roman" w:hAnsi="Times New Roman"/>
+                <w:color w:val="000000"/>
+                <w:sz w:val="20"/>
+              </w:rPr>
+              <w:t>services/offline_sync_service.dart</w:t>
+            </w:r>
+          </w:p>
+        </w:tc>
+        <w:tc>
+          <w:tcPr>
+            <w:tcW w:type="dxa" w:w="2351"/>
+          </w:tcPr>
+          <w:p>
+            <w:pPr>
+              <w:spacing w:line="288" w:lineRule="auto" w:after="40"/>
+            </w:pPr>
+            <w:r>
+              <w:rPr>
+                <w:rFonts w:ascii="Times New Roman" w:hAnsi="Times New Roman"/>
+                <w:color w:val="000000"/>
+                <w:sz w:val="20"/>
+              </w:rPr>
+              <w:t>Đồng bộ đơn hàng ngoại tuyến khi có mạng trở lại</w:t>
+            </w:r>
+          </w:p>
+        </w:tc>
+        <w:tc>
+          <w:tcPr>
+            <w:tcW w:type="dxa" w:w="2351"/>
+          </w:tcPr>
+          <w:p>
+            <w:pPr>
+              <w:spacing w:line="288" w:lineRule="auto" w:after="40"/>
+              <w:jc w:val="center"/>
+            </w:pPr>
+            <w:r>
+              <w:rPr>
+                <w:rFonts w:ascii="Times New Roman" w:hAnsi="Times New Roman"/>
+                <w:b/>
+                <w:color w:val="000000"/>
+                <w:sz w:val="20"/>
+              </w:rPr>
+              <w:t>Thành viên 1 (Bạn)</w:t>
+            </w:r>
+          </w:p>
+        </w:tc>
+      </w:tr>
+      <w:tr>
+        <w:tc>
+          <w:tcPr>
+            <w:tcW w:type="dxa" w:w="2351"/>
+          </w:tcPr>
+          <w:p>
+            <w:pPr>
+              <w:spacing w:line="288" w:lineRule="auto" w:after="40"/>
+              <w:jc w:val="center"/>
+            </w:pPr>
+            <w:r>
+              <w:rPr>
+                <w:rFonts w:ascii="Times New Roman" w:hAnsi="Times New Roman"/>
+                <w:b/>
+                <w:color w:val="000000"/>
+                <w:sz w:val="20"/>
+              </w:rPr>
+              <w:t>Mobile</w:t>
+            </w:r>
+          </w:p>
+        </w:tc>
+        <w:tc>
+          <w:tcPr>
+            <w:tcW w:type="dxa" w:w="2351"/>
+          </w:tcPr>
+          <w:p>
+            <w:pPr>
+              <w:spacing w:line="288" w:lineRule="auto" w:after="40"/>
+            </w:pPr>
+            <w:r>
+              <w:rPr>
+                <w:rFonts w:ascii="Times New Roman" w:hAnsi="Times New Roman"/>
+                <w:color w:val="000000"/>
+                <w:sz w:val="20"/>
+              </w:rPr>
+              <w:t>models/category.dart, product.dart</w:t>
+            </w:r>
+          </w:p>
+        </w:tc>
+        <w:tc>
+          <w:tcPr>
+            <w:tcW w:type="dxa" w:w="2351"/>
+          </w:tcPr>
+          <w:p>
+            <w:pPr>
+              <w:spacing w:line="288" w:lineRule="auto" w:after="40"/>
+            </w:pPr>
+            <w:r>
+              <w:rPr>
+                <w:rFonts w:ascii="Times New Roman" w:hAnsi="Times New Roman"/>
+                <w:color w:val="000000"/>
+                <w:sz w:val="20"/>
+              </w:rPr>
+              <w:t>Model DTO có factory fromMap() và toMap()</w:t>
+            </w:r>
+          </w:p>
+        </w:tc>
+        <w:tc>
+          <w:tcPr>
+            <w:tcW w:type="dxa" w:w="2351"/>
+          </w:tcPr>
+          <w:p>
+            <w:pPr>
+              <w:spacing w:line="288" w:lineRule="auto" w:after="40"/>
+              <w:jc w:val="center"/>
+            </w:pPr>
+            <w:r>
+              <w:rPr>
+                <w:rFonts w:ascii="Times New Roman" w:hAnsi="Times New Roman"/>
+                <w:b/>
+                <w:color w:val="000000"/>
+                <w:sz w:val="20"/>
+              </w:rPr>
+              <w:t>Thành viên 2 (Collab A)</w:t>
+            </w:r>
+          </w:p>
+        </w:tc>
+      </w:tr>
+      <w:tr>
+        <w:tc>
+          <w:tcPr>
+            <w:tcW w:type="dxa" w:w="2351"/>
+          </w:tcPr>
+          <w:p>
+            <w:pPr>
+              <w:spacing w:line="288" w:lineRule="auto" w:after="40"/>
+              <w:jc w:val="center"/>
+            </w:pPr>
+            <w:r>
+              <w:rPr>
+                <w:rFonts w:ascii="Times New Roman" w:hAnsi="Times New Roman"/>
+                <w:b/>
+                <w:color w:val="000000"/>
+                <w:sz w:val="20"/>
+              </w:rPr>
+              <w:t>Mobile</w:t>
+            </w:r>
+          </w:p>
+        </w:tc>
+        <w:tc>
+          <w:tcPr>
+            <w:tcW w:type="dxa" w:w="2351"/>
+          </w:tcPr>
+          <w:p>
+            <w:pPr>
+              <w:spacing w:line="288" w:lineRule="auto" w:after="40"/>
+            </w:pPr>
+            <w:r>
+              <w:rPr>
+                <w:rFonts w:ascii="Times New Roman" w:hAnsi="Times New Roman"/>
+                <w:color w:val="000000"/>
+                <w:sz w:val="20"/>
+              </w:rPr>
+              <w:t>repositories/category_repo, product_repo</w:t>
+            </w:r>
+          </w:p>
+        </w:tc>
+        <w:tc>
+          <w:tcPr>
+            <w:tcW w:type="dxa" w:w="2351"/>
+          </w:tcPr>
+          <w:p>
+            <w:pPr>
+              <w:spacing w:line="288" w:lineRule="auto" w:after="40"/>
+            </w:pPr>
+            <w:r>
+              <w:rPr>
+                <w:rFonts w:ascii="Times New Roman" w:hAnsi="Times New Roman"/>
+                <w:color w:val="000000"/>
+                <w:sz w:val="20"/>
+              </w:rPr>
+              <w:t>Gọi HTTP GET/POST/PUT/DELETE danh mục &amp; sản phẩm</w:t>
+            </w:r>
+          </w:p>
+        </w:tc>
+        <w:tc>
+          <w:tcPr>
+            <w:tcW w:type="dxa" w:w="2351"/>
+          </w:tcPr>
+          <w:p>
+            <w:pPr>
+              <w:spacing w:line="288" w:lineRule="auto" w:after="40"/>
+              <w:jc w:val="center"/>
+            </w:pPr>
+            <w:r>
+              <w:rPr>
+                <w:rFonts w:ascii="Times New Roman" w:hAnsi="Times New Roman"/>
+                <w:b/>
+                <w:color w:val="000000"/>
+                <w:sz w:val="20"/>
+              </w:rPr>
+              <w:t>Thành viên 2 (Collab A)</w:t>
+            </w:r>
+          </w:p>
+        </w:tc>
+      </w:tr>
+      <w:tr>
+        <w:tc>
+          <w:tcPr>
+            <w:tcW w:type="dxa" w:w="2351"/>
+          </w:tcPr>
+          <w:p>
+            <w:pPr>
+              <w:spacing w:line="288" w:lineRule="auto" w:after="40"/>
+              <w:jc w:val="center"/>
+            </w:pPr>
+            <w:r>
+              <w:rPr>
+                <w:rFonts w:ascii="Times New Roman" w:hAnsi="Times New Roman"/>
+                <w:b/>
+                <w:color w:val="000000"/>
+                <w:sz w:val="20"/>
+              </w:rPr>
+              <w:t>Mobile</w:t>
+            </w:r>
+          </w:p>
+        </w:tc>
+        <w:tc>
+          <w:tcPr>
+            <w:tcW w:type="dxa" w:w="2351"/>
+          </w:tcPr>
+          <w:p>
+            <w:pPr>
+              <w:spacing w:line="288" w:lineRule="auto" w:after="40"/>
+            </w:pPr>
+            <w:r>
+              <w:rPr>
+                <w:rFonts w:ascii="Times New Roman" w:hAnsi="Times New Roman"/>
+                <w:color w:val="000000"/>
+                <w:sz w:val="20"/>
+              </w:rPr>
+              <w:t>views/home_page.dart</w:t>
+            </w:r>
+          </w:p>
+        </w:tc>
+        <w:tc>
+          <w:tcPr>
+            <w:tcW w:type="dxa" w:w="2351"/>
+          </w:tcPr>
+          <w:p>
+            <w:pPr>
+              <w:spacing w:line="288" w:lineRule="auto" w:after="40"/>
+            </w:pPr>
+            <w:r>
+              <w:rPr>
+                <w:rFonts w:ascii="Times New Roman" w:hAnsi="Times New Roman"/>
+                <w:color w:val="000000"/>
+                <w:sz w:val="20"/>
+              </w:rPr>
+              <w:t>Trang chủ: Menu ngang, món mới &amp; search phân trang</w:t>
+            </w:r>
+          </w:p>
+        </w:tc>
+        <w:tc>
+          <w:tcPr>
+            <w:tcW w:type="dxa" w:w="2351"/>
+          </w:tcPr>
+          <w:p>
+            <w:pPr>
+              <w:spacing w:line="288" w:lineRule="auto" w:after="40"/>
+              <w:jc w:val="center"/>
+            </w:pPr>
+            <w:r>
+              <w:rPr>
+                <w:rFonts w:ascii="Times New Roman" w:hAnsi="Times New Roman"/>
+                <w:b/>
+                <w:color w:val="000000"/>
+                <w:sz w:val="20"/>
+              </w:rPr>
+              <w:t>Thành viên 2 (Collab A)</w:t>
+            </w:r>
+          </w:p>
+        </w:tc>
+      </w:tr>
+      <w:tr>
+        <w:tc>
+          <w:tcPr>
+            <w:tcW w:type="dxa" w:w="2351"/>
+          </w:tcPr>
+          <w:p>
+            <w:pPr>
+              <w:spacing w:line="288" w:lineRule="auto" w:after="40"/>
+              <w:jc w:val="center"/>
+            </w:pPr>
+            <w:r>
+              <w:rPr>
+                <w:rFonts w:ascii="Times New Roman" w:hAnsi="Times New Roman"/>
+                <w:b/>
+                <w:color w:val="000000"/>
+                <w:sz w:val="20"/>
+              </w:rPr>
+              <w:t>Mobile</w:t>
+            </w:r>
+          </w:p>
+        </w:tc>
+        <w:tc>
+          <w:tcPr>
+            <w:tcW w:type="dxa" w:w="2351"/>
+          </w:tcPr>
+          <w:p>
+            <w:pPr>
+              <w:spacing w:line="288" w:lineRule="auto" w:after="40"/>
+            </w:pPr>
+            <w:r>
+              <w:rPr>
+                <w:rFonts w:ascii="Times New Roman" w:hAnsi="Times New Roman"/>
+                <w:color w:val="000000"/>
+                <w:sz w:val="20"/>
+              </w:rPr>
+              <w:t>views/product_detail_page.dart</w:t>
+            </w:r>
+          </w:p>
+        </w:tc>
+        <w:tc>
+          <w:tcPr>
+            <w:tcW w:type="dxa" w:w="2351"/>
+          </w:tcPr>
+          <w:p>
+            <w:pPr>
+              <w:spacing w:line="288" w:lineRule="auto" w:after="40"/>
+            </w:pPr>
+            <w:r>
+              <w:rPr>
+                <w:rFonts w:ascii="Times New Roman" w:hAnsi="Times New Roman"/>
+                <w:color w:val="000000"/>
+                <w:sz w:val="20"/>
+              </w:rPr>
+              <w:t>Xem hình lớn, Size/Topping, món liên quan, thêm giỏ</w:t>
+            </w:r>
+          </w:p>
+        </w:tc>
+        <w:tc>
+          <w:tcPr>
+            <w:tcW w:type="dxa" w:w="2351"/>
+          </w:tcPr>
+          <w:p>
+            <w:pPr>
+              <w:spacing w:line="288" w:lineRule="auto" w:after="40"/>
+              <w:jc w:val="center"/>
+            </w:pPr>
+            <w:r>
+              <w:rPr>
+                <w:rFonts w:ascii="Times New Roman" w:hAnsi="Times New Roman"/>
+                <w:b/>
+                <w:color w:val="000000"/>
+                <w:sz w:val="20"/>
+              </w:rPr>
+              <w:t>Thành viên 2 (Collab A)</w:t>
+            </w:r>
+          </w:p>
+        </w:tc>
+      </w:tr>
+      <w:tr>
+        <w:tc>
+          <w:tcPr>
+            <w:tcW w:type="dxa" w:w="2351"/>
+          </w:tcPr>
+          <w:p>
+            <w:pPr>
+              <w:spacing w:line="288" w:lineRule="auto" w:after="40"/>
+              <w:jc w:val="center"/>
+            </w:pPr>
+            <w:r>
+              <w:rPr>
+                <w:rFonts w:ascii="Times New Roman" w:hAnsi="Times New Roman"/>
+                <w:b/>
+                <w:color w:val="000000"/>
+                <w:sz w:val="20"/>
+              </w:rPr>
+              <w:t>Mobile</w:t>
+            </w:r>
+          </w:p>
+        </w:tc>
+        <w:tc>
+          <w:tcPr>
+            <w:tcW w:type="dxa" w:w="2351"/>
+          </w:tcPr>
+          <w:p>
+            <w:pPr>
+              <w:spacing w:line="288" w:lineRule="auto" w:after="40"/>
+            </w:pPr>
+            <w:r>
+              <w:rPr>
+                <w:rFonts w:ascii="Times New Roman" w:hAnsi="Times New Roman"/>
+                <w:color w:val="000000"/>
+                <w:sz w:val="20"/>
+              </w:rPr>
+              <w:t>views/cart_page.dart</w:t>
+            </w:r>
+          </w:p>
+        </w:tc>
+        <w:tc>
+          <w:tcPr>
+            <w:tcW w:type="dxa" w:w="2351"/>
+          </w:tcPr>
+          <w:p>
+            <w:pPr>
+              <w:spacing w:line="288" w:lineRule="auto" w:after="40"/>
+            </w:pPr>
+            <w:r>
+              <w:rPr>
+                <w:rFonts w:ascii="Times New Roman" w:hAnsi="Times New Roman"/>
+                <w:color w:val="000000"/>
+                <w:sz w:val="20"/>
+              </w:rPr>
+              <w:t>Giỏ hàng SQLite: Badge, nút +/- tính tiền, xóa món</w:t>
+            </w:r>
+          </w:p>
+        </w:tc>
+        <w:tc>
+          <w:tcPr>
+            <w:tcW w:type="dxa" w:w="2351"/>
+          </w:tcPr>
+          <w:p>
+            <w:pPr>
+              <w:spacing w:line="288" w:lineRule="auto" w:after="40"/>
+              <w:jc w:val="center"/>
+            </w:pPr>
+            <w:r>
+              <w:rPr>
+                <w:rFonts w:ascii="Times New Roman" w:hAnsi="Times New Roman"/>
+                <w:b/>
+                <w:color w:val="000000"/>
+                <w:sz w:val="20"/>
+              </w:rPr>
+              <w:t>Thành viên 2 (Collab A)</w:t>
+            </w:r>
+          </w:p>
+        </w:tc>
+      </w:tr>
+      <w:tr>
+        <w:tc>
+          <w:tcPr>
+            <w:tcW w:type="dxa" w:w="2351"/>
+          </w:tcPr>
+          <w:p>
+            <w:pPr>
+              <w:spacing w:line="288" w:lineRule="auto" w:after="40"/>
+              <w:jc w:val="center"/>
+            </w:pPr>
+            <w:r>
+              <w:rPr>
+                <w:rFonts w:ascii="Times New Roman" w:hAnsi="Times New Roman"/>
+                <w:b/>
+                <w:color w:val="000000"/>
+                <w:sz w:val="20"/>
+              </w:rPr>
+              <w:t>Mobile</w:t>
+            </w:r>
+          </w:p>
+        </w:tc>
+        <w:tc>
+          <w:tcPr>
+            <w:tcW w:type="dxa" w:w="2351"/>
+          </w:tcPr>
+          <w:p>
+            <w:pPr>
+              <w:spacing w:line="288" w:lineRule="auto" w:after="40"/>
+            </w:pPr>
+            <w:r>
+              <w:rPr>
+                <w:rFonts w:ascii="Times New Roman" w:hAnsi="Times New Roman"/>
+                <w:color w:val="000000"/>
+                <w:sz w:val="20"/>
+              </w:rPr>
+              <w:t>views/admin/admin_category_page.dart</w:t>
+            </w:r>
+          </w:p>
+        </w:tc>
+        <w:tc>
+          <w:tcPr>
+            <w:tcW w:type="dxa" w:w="2351"/>
+          </w:tcPr>
+          <w:p>
+            <w:pPr>
+              <w:spacing w:line="288" w:lineRule="auto" w:after="40"/>
+            </w:pPr>
+            <w:r>
+              <w:rPr>
+                <w:rFonts w:ascii="Times New Roman" w:hAnsi="Times New Roman"/>
+                <w:color w:val="000000"/>
+                <w:sz w:val="20"/>
+              </w:rPr>
+              <w:t>Quản trị danh mục: Thêm/Sửa/Xóa chọn ảnh từ máy</w:t>
+            </w:r>
+          </w:p>
+        </w:tc>
+        <w:tc>
+          <w:tcPr>
+            <w:tcW w:type="dxa" w:w="2351"/>
+          </w:tcPr>
+          <w:p>
+            <w:pPr>
+              <w:spacing w:line="288" w:lineRule="auto" w:after="40"/>
+              <w:jc w:val="center"/>
+            </w:pPr>
+            <w:r>
+              <w:rPr>
+                <w:rFonts w:ascii="Times New Roman" w:hAnsi="Times New Roman"/>
+                <w:b/>
+                <w:color w:val="000000"/>
+                <w:sz w:val="20"/>
+              </w:rPr>
+              <w:t>Thành viên 2 (Collab A)</w:t>
+            </w:r>
+          </w:p>
+        </w:tc>
+      </w:tr>
+      <w:tr>
+        <w:tc>
+          <w:tcPr>
+            <w:tcW w:type="dxa" w:w="2351"/>
+          </w:tcPr>
+          <w:p>
+            <w:pPr>
+              <w:spacing w:line="288" w:lineRule="auto" w:after="40"/>
+              <w:jc w:val="center"/>
+            </w:pPr>
+            <w:r>
+              <w:rPr>
+                <w:rFonts w:ascii="Times New Roman" w:hAnsi="Times New Roman"/>
+                <w:b/>
+                <w:color w:val="000000"/>
+                <w:sz w:val="20"/>
+              </w:rPr>
+              <w:t>Mobile</w:t>
+            </w:r>
+          </w:p>
+        </w:tc>
+        <w:tc>
+          <w:tcPr>
+            <w:tcW w:type="dxa" w:w="2351"/>
+          </w:tcPr>
+          <w:p>
+            <w:pPr>
+              <w:spacing w:line="288" w:lineRule="auto" w:after="40"/>
+            </w:pPr>
+            <w:r>
+              <w:rPr>
+                <w:rFonts w:ascii="Times New Roman" w:hAnsi="Times New Roman"/>
+                <w:color w:val="000000"/>
+                <w:sz w:val="20"/>
+              </w:rPr>
+              <w:t>views/admin/admin_product_page.dart</w:t>
+            </w:r>
+          </w:p>
+        </w:tc>
+        <w:tc>
+          <w:tcPr>
+            <w:tcW w:type="dxa" w:w="2351"/>
+          </w:tcPr>
+          <w:p>
+            <w:pPr>
+              <w:spacing w:line="288" w:lineRule="auto" w:after="40"/>
+            </w:pPr>
+            <w:r>
+              <w:rPr>
+                <w:rFonts w:ascii="Times New Roman" w:hAnsi="Times New Roman"/>
+                <w:color w:val="000000"/>
+                <w:sz w:val="20"/>
+              </w:rPr>
+              <w:t>Quản trị món ăn: Cuộn tải thêm phân trang, form món</w:t>
+            </w:r>
+          </w:p>
+        </w:tc>
+        <w:tc>
+          <w:tcPr>
+            <w:tcW w:type="dxa" w:w="2351"/>
+          </w:tcPr>
+          <w:p>
+            <w:pPr>
+              <w:spacing w:line="288" w:lineRule="auto" w:after="40"/>
+              <w:jc w:val="center"/>
+            </w:pPr>
+            <w:r>
+              <w:rPr>
+                <w:rFonts w:ascii="Times New Roman" w:hAnsi="Times New Roman"/>
+                <w:b/>
+                <w:color w:val="000000"/>
+                <w:sz w:val="20"/>
+              </w:rPr>
+              <w:t>Thành viên 2 (Collab A)</w:t>
+            </w:r>
+          </w:p>
+        </w:tc>
+      </w:tr>
+      <w:tr>
+        <w:tc>
+          <w:tcPr>
+            <w:tcW w:type="dxa" w:w="2351"/>
+          </w:tcPr>
+          <w:p>
+            <w:pPr>
+              <w:spacing w:line="288" w:lineRule="auto" w:after="40"/>
+              <w:jc w:val="center"/>
+            </w:pPr>
+            <w:r>
+              <w:rPr>
+                <w:rFonts w:ascii="Times New Roman" w:hAnsi="Times New Roman"/>
+                <w:b/>
+                <w:color w:val="000000"/>
+                <w:sz w:val="20"/>
+              </w:rPr>
+              <w:t>Mobile</w:t>
+            </w:r>
+          </w:p>
+        </w:tc>
+        <w:tc>
+          <w:tcPr>
+            <w:tcW w:type="dxa" w:w="2351"/>
+          </w:tcPr>
+          <w:p>
+            <w:pPr>
+              <w:spacing w:line="288" w:lineRule="auto" w:after="40"/>
+            </w:pPr>
+            <w:r>
+              <w:rPr>
+                <w:rFonts w:ascii="Times New Roman" w:hAnsi="Times New Roman"/>
+                <w:color w:val="000000"/>
+                <w:sz w:val="20"/>
+              </w:rPr>
+              <w:t>models/user.dart, order.dart, payment.dart</w:t>
+            </w:r>
+          </w:p>
+        </w:tc>
+        <w:tc>
+          <w:tcPr>
+            <w:tcW w:type="dxa" w:w="2351"/>
+          </w:tcPr>
+          <w:p>
+            <w:pPr>
+              <w:spacing w:line="288" w:lineRule="auto" w:after="40"/>
+            </w:pPr>
+            <w:r>
+              <w:rPr>
+                <w:rFonts w:ascii="Times New Roman" w:hAnsi="Times New Roman"/>
+                <w:color w:val="000000"/>
+                <w:sz w:val="20"/>
+              </w:rPr>
+              <w:t>Model DTO cho Auth, Đơn hàng và Thanh toán</w:t>
+            </w:r>
+          </w:p>
+        </w:tc>
+        <w:tc>
+          <w:tcPr>
+            <w:tcW w:type="dxa" w:w="2351"/>
+          </w:tcPr>
+          <w:p>
+            <w:pPr>
+              <w:spacing w:line="288" w:lineRule="auto" w:after="40"/>
+              <w:jc w:val="center"/>
+            </w:pPr>
+            <w:r>
+              <w:rPr>
+                <w:rFonts w:ascii="Times New Roman" w:hAnsi="Times New Roman"/>
+                <w:b/>
+                <w:color w:val="000000"/>
+                <w:sz w:val="20"/>
+              </w:rPr>
+              <w:t>Thành viên 3 (Collab B)</w:t>
+            </w:r>
+          </w:p>
+        </w:tc>
+      </w:tr>
+      <w:tr>
+        <w:tc>
+          <w:tcPr>
+            <w:tcW w:type="dxa" w:w="2351"/>
+          </w:tcPr>
+          <w:p>
+            <w:pPr>
+              <w:spacing w:line="288" w:lineRule="auto" w:after="40"/>
+              <w:jc w:val="center"/>
+            </w:pPr>
+            <w:r>
+              <w:rPr>
+                <w:rFonts w:ascii="Times New Roman" w:hAnsi="Times New Roman"/>
+                <w:b/>
+                <w:color w:val="000000"/>
+                <w:sz w:val="20"/>
+              </w:rPr>
+              <w:t>Mobile</w:t>
+            </w:r>
+          </w:p>
+        </w:tc>
+        <w:tc>
+          <w:tcPr>
+            <w:tcW w:type="dxa" w:w="2351"/>
+          </w:tcPr>
+          <w:p>
+            <w:pPr>
+              <w:spacing w:line="288" w:lineRule="auto" w:after="40"/>
+            </w:pPr>
+            <w:r>
+              <w:rPr>
+                <w:rFonts w:ascii="Times New Roman" w:hAnsi="Times New Roman"/>
+                <w:color w:val="000000"/>
+                <w:sz w:val="20"/>
+              </w:rPr>
+              <w:t>repositories/auth_repo, order_repo</w:t>
+            </w:r>
+          </w:p>
+        </w:tc>
+        <w:tc>
+          <w:tcPr>
+            <w:tcW w:type="dxa" w:w="2351"/>
+          </w:tcPr>
+          <w:p>
+            <w:pPr>
+              <w:spacing w:line="288" w:lineRule="auto" w:after="40"/>
+            </w:pPr>
+            <w:r>
+              <w:rPr>
+                <w:rFonts w:ascii="Times New Roman" w:hAnsi="Times New Roman"/>
+                <w:color w:val="000000"/>
+                <w:sz w:val="20"/>
+              </w:rPr>
+              <w:t>Gọi API Auth, Checkout đơn hàng, Thanh toán</w:t>
+            </w:r>
+          </w:p>
+        </w:tc>
+        <w:tc>
+          <w:tcPr>
+            <w:tcW w:type="dxa" w:w="2351"/>
+          </w:tcPr>
+          <w:p>
+            <w:pPr>
+              <w:spacing w:line="288" w:lineRule="auto" w:after="40"/>
+              <w:jc w:val="center"/>
+            </w:pPr>
+            <w:r>
+              <w:rPr>
+                <w:rFonts w:ascii="Times New Roman" w:hAnsi="Times New Roman"/>
+                <w:b/>
+                <w:color w:val="000000"/>
+                <w:sz w:val="20"/>
+              </w:rPr>
+              <w:t>Thành viên 3 (Collab B)</w:t>
+            </w:r>
+          </w:p>
+        </w:tc>
+      </w:tr>
+      <w:tr>
+        <w:tc>
+          <w:tcPr>
+            <w:tcW w:type="dxa" w:w="2351"/>
+          </w:tcPr>
+          <w:p>
+            <w:pPr>
+              <w:spacing w:line="288" w:lineRule="auto" w:after="40"/>
+              <w:jc w:val="center"/>
+            </w:pPr>
+            <w:r>
+              <w:rPr>
+                <w:rFonts w:ascii="Times New Roman" w:hAnsi="Times New Roman"/>
+                <w:b/>
+                <w:color w:val="000000"/>
+                <w:sz w:val="20"/>
+              </w:rPr>
+              <w:t>Mobile</w:t>
+            </w:r>
+          </w:p>
+        </w:tc>
+        <w:tc>
+          <w:tcPr>
+            <w:tcW w:type="dxa" w:w="2351"/>
+          </w:tcPr>
+          <w:p>
+            <w:pPr>
+              <w:spacing w:line="288" w:lineRule="auto" w:after="40"/>
+            </w:pPr>
+            <w:r>
+              <w:rPr>
+                <w:rFonts w:ascii="Times New Roman" w:hAnsi="Times New Roman"/>
+                <w:color w:val="000000"/>
+                <w:sz w:val="20"/>
+              </w:rPr>
+              <w:t>views/auth/login_page, register_page.dart</w:t>
+            </w:r>
+          </w:p>
+        </w:tc>
+        <w:tc>
+          <w:tcPr>
+            <w:tcW w:type="dxa" w:w="2351"/>
+          </w:tcPr>
+          <w:p>
+            <w:pPr>
+              <w:spacing w:line="288" w:lineRule="auto" w:after="40"/>
+            </w:pPr>
+            <w:r>
+              <w:rPr>
+                <w:rFonts w:ascii="Times New Roman" w:hAnsi="Times New Roman"/>
+                <w:color w:val="000000"/>
+                <w:sz w:val="20"/>
+              </w:rPr>
+              <w:t>Đăng nhập/ký, lưu session SQLite, phân quyền Role</w:t>
+            </w:r>
+          </w:p>
+        </w:tc>
+        <w:tc>
+          <w:tcPr>
+            <w:tcW w:type="dxa" w:w="2351"/>
+          </w:tcPr>
+          <w:p>
+            <w:pPr>
+              <w:spacing w:line="288" w:lineRule="auto" w:after="40"/>
+              <w:jc w:val="center"/>
+            </w:pPr>
+            <w:r>
+              <w:rPr>
+                <w:rFonts w:ascii="Times New Roman" w:hAnsi="Times New Roman"/>
+                <w:b/>
+                <w:color w:val="000000"/>
+                <w:sz w:val="20"/>
+              </w:rPr>
+              <w:t>Thành viên 3 (Collab B)</w:t>
+            </w:r>
+          </w:p>
+        </w:tc>
+      </w:tr>
+      <w:tr>
+        <w:tc>
+          <w:tcPr>
+            <w:tcW w:type="dxa" w:w="2351"/>
+          </w:tcPr>
+          <w:p>
+            <w:pPr>
+              <w:spacing w:line="288" w:lineRule="auto" w:after="40"/>
+              <w:jc w:val="center"/>
+            </w:pPr>
+            <w:r>
+              <w:rPr>
+                <w:rFonts w:ascii="Times New Roman" w:hAnsi="Times New Roman"/>
+                <w:b/>
+                <w:color w:val="000000"/>
+                <w:sz w:val="20"/>
+              </w:rPr>
+              <w:t>Mobile</w:t>
+            </w:r>
+          </w:p>
+        </w:tc>
+        <w:tc>
+          <w:tcPr>
+            <w:tcW w:type="dxa" w:w="2351"/>
+          </w:tcPr>
+          <w:p>
+            <w:pPr>
+              <w:spacing w:line="288" w:lineRule="auto" w:after="40"/>
+            </w:pPr>
+            <w:r>
+              <w:rPr>
+                <w:rFonts w:ascii="Times New Roman" w:hAnsi="Times New Roman"/>
+                <w:color w:val="000000"/>
+                <w:sz w:val="20"/>
+              </w:rPr>
+              <w:t>views/order/order_checkout_page.dart</w:t>
+            </w:r>
+          </w:p>
+        </w:tc>
+        <w:tc>
+          <w:tcPr>
+            <w:tcW w:type="dxa" w:w="2351"/>
+          </w:tcPr>
+          <w:p>
+            <w:pPr>
+              <w:spacing w:line="288" w:lineRule="auto" w:after="40"/>
+            </w:pPr>
+            <w:r>
+              <w:rPr>
+                <w:rFonts w:ascii="Times New Roman" w:hAnsi="Times New Roman"/>
+                <w:color w:val="000000"/>
+                <w:sz w:val="20"/>
+              </w:rPr>
+              <w:t>Chọn bàn, xác nhận đặt món, phương thức thanh toán</w:t>
+            </w:r>
+          </w:p>
+        </w:tc>
+        <w:tc>
+          <w:tcPr>
+            <w:tcW w:type="dxa" w:w="2351"/>
+          </w:tcPr>
+          <w:p>
+            <w:pPr>
+              <w:spacing w:line="288" w:lineRule="auto" w:after="40"/>
+              <w:jc w:val="center"/>
+            </w:pPr>
+            <w:r>
+              <w:rPr>
+                <w:rFonts w:ascii="Times New Roman" w:hAnsi="Times New Roman"/>
+                <w:b/>
+                <w:color w:val="000000"/>
+                <w:sz w:val="20"/>
+              </w:rPr>
+              <w:t>Thành viên 3 (Collab B)</w:t>
+            </w:r>
+          </w:p>
+        </w:tc>
+      </w:tr>
+      <w:tr>
+        <w:tc>
+          <w:tcPr>
+            <w:tcW w:type="dxa" w:w="2351"/>
+          </w:tcPr>
+          <w:p>
+            <w:pPr>
+              <w:spacing w:line="288" w:lineRule="auto" w:after="40"/>
+              <w:jc w:val="center"/>
+            </w:pPr>
+            <w:r>
+              <w:rPr>
+                <w:rFonts w:ascii="Times New Roman" w:hAnsi="Times New Roman"/>
+                <w:b/>
+                <w:color w:val="000000"/>
+                <w:sz w:val="20"/>
+              </w:rPr>
+              <w:t>Mobile</w:t>
+            </w:r>
+          </w:p>
+        </w:tc>
+        <w:tc>
+          <w:tcPr>
+            <w:tcW w:type="dxa" w:w="2351"/>
+          </w:tcPr>
+          <w:p>
+            <w:pPr>
+              <w:spacing w:line="288" w:lineRule="auto" w:after="40"/>
+            </w:pPr>
+            <w:r>
+              <w:rPr>
+                <w:rFonts w:ascii="Times New Roman" w:hAnsi="Times New Roman"/>
+                <w:color w:val="000000"/>
+                <w:sz w:val="20"/>
+              </w:rPr>
+              <w:t>views/order/order_detail_page.dart</w:t>
+            </w:r>
+          </w:p>
+        </w:tc>
+        <w:tc>
+          <w:tcPr>
+            <w:tcW w:type="dxa" w:w="2351"/>
+          </w:tcPr>
+          <w:p>
+            <w:pPr>
+              <w:spacing w:line="288" w:lineRule="auto" w:after="40"/>
+            </w:pPr>
+            <w:r>
+              <w:rPr>
+                <w:rFonts w:ascii="Times New Roman" w:hAnsi="Times New Roman"/>
+                <w:color w:val="000000"/>
+                <w:sz w:val="20"/>
+              </w:rPr>
+              <w:t>Chi tiết đơn, hiển thị mã VietQR động cho khách quét</w:t>
+            </w:r>
+          </w:p>
+        </w:tc>
+        <w:tc>
+          <w:tcPr>
+            <w:tcW w:type="dxa" w:w="2351"/>
+          </w:tcPr>
+          <w:p>
+            <w:pPr>
+              <w:spacing w:line="288" w:lineRule="auto" w:after="40"/>
+              <w:jc w:val="center"/>
+            </w:pPr>
+            <w:r>
+              <w:rPr>
+                <w:rFonts w:ascii="Times New Roman" w:hAnsi="Times New Roman"/>
+                <w:b/>
+                <w:color w:val="000000"/>
+                <w:sz w:val="20"/>
+              </w:rPr>
+              <w:t>Thành viên 3 (Collab B)</w:t>
+            </w:r>
+          </w:p>
+        </w:tc>
+      </w:tr>
+      <w:tr>
+        <w:tc>
+          <w:tcPr>
+            <w:tcW w:type="dxa" w:w="2351"/>
+          </w:tcPr>
+          <w:p>
+            <w:pPr>
+              <w:spacing w:line="288" w:lineRule="auto" w:after="40"/>
+              <w:jc w:val="center"/>
+            </w:pPr>
+            <w:r>
+              <w:rPr>
+                <w:rFonts w:ascii="Times New Roman" w:hAnsi="Times New Roman"/>
+                <w:b/>
+                <w:color w:val="000000"/>
+                <w:sz w:val="20"/>
+              </w:rPr>
+              <w:t>Mobile</w:t>
+            </w:r>
+          </w:p>
+        </w:tc>
+        <w:tc>
+          <w:tcPr>
+            <w:tcW w:type="dxa" w:w="2351"/>
+          </w:tcPr>
+          <w:p>
+            <w:pPr>
+              <w:spacing w:line="288" w:lineRule="auto" w:after="40"/>
+            </w:pPr>
+            <w:r>
+              <w:rPr>
+                <w:rFonts w:ascii="Times New Roman" w:hAnsi="Times New Roman"/>
+                <w:color w:val="000000"/>
+                <w:sz w:val="20"/>
+              </w:rPr>
+              <w:t>views/admin/admin_order_list_page.dart</w:t>
+            </w:r>
+          </w:p>
+        </w:tc>
+        <w:tc>
+          <w:tcPr>
+            <w:tcW w:type="dxa" w:w="2351"/>
+          </w:tcPr>
+          <w:p>
+            <w:pPr>
+              <w:spacing w:line="288" w:lineRule="auto" w:after="40"/>
+            </w:pPr>
+            <w:r>
+              <w:rPr>
+                <w:rFonts w:ascii="Times New Roman" w:hAnsi="Times New Roman"/>
+                <w:color w:val="000000"/>
+                <w:sz w:val="20"/>
+              </w:rPr>
+              <w:t>Dashboard đơn hàng, bộ lọc DateRangePicker</w:t>
+            </w:r>
+          </w:p>
+        </w:tc>
+        <w:tc>
+          <w:tcPr>
+            <w:tcW w:type="dxa" w:w="2351"/>
+          </w:tcPr>
+          <w:p>
+            <w:pPr>
+              <w:spacing w:line="288" w:lineRule="auto" w:after="40"/>
+              <w:jc w:val="center"/>
+            </w:pPr>
+            <w:r>
+              <w:rPr>
+                <w:rFonts w:ascii="Times New Roman" w:hAnsi="Times New Roman"/>
+                <w:b/>
+                <w:color w:val="000000"/>
+                <w:sz w:val="20"/>
+              </w:rPr>
+              <w:t>Thành viên 3 (Collab B)</w:t>
+            </w:r>
+          </w:p>
+        </w:tc>
+      </w:tr>
+      <w:tr>
+        <w:tc>
+          <w:tcPr>
+            <w:tcW w:type="dxa" w:w="2351"/>
+          </w:tcPr>
+          <w:p>
+            <w:pPr>
+              <w:spacing w:line="288" w:lineRule="auto" w:after="40"/>
+              <w:jc w:val="center"/>
+            </w:pPr>
+            <w:r>
+              <w:rPr>
+                <w:rFonts w:ascii="Times New Roman" w:hAnsi="Times New Roman"/>
+                <w:b/>
+                <w:color w:val="000000"/>
+                <w:sz w:val="20"/>
+              </w:rPr>
+              <w:t>Mobile</w:t>
+            </w:r>
+          </w:p>
+        </w:tc>
+        <w:tc>
+          <w:tcPr>
+            <w:tcW w:type="dxa" w:w="2351"/>
+          </w:tcPr>
+          <w:p>
+            <w:pPr>
+              <w:spacing w:line="288" w:lineRule="auto" w:after="40"/>
+            </w:pPr>
+            <w:r>
+              <w:rPr>
+                <w:rFonts w:ascii="Times New Roman" w:hAnsi="Times New Roman"/>
+                <w:color w:val="000000"/>
+                <w:sz w:val="20"/>
+              </w:rPr>
+              <w:t>views/kitchen/kitchen_display_page.dart</w:t>
+            </w:r>
+          </w:p>
+        </w:tc>
+        <w:tc>
+          <w:tcPr>
+            <w:tcW w:type="dxa" w:w="2351"/>
+          </w:tcPr>
+          <w:p>
+            <w:pPr>
+              <w:spacing w:line="288" w:lineRule="auto" w:after="40"/>
+            </w:pPr>
+            <w:r>
+              <w:rPr>
+                <w:rFonts w:ascii="Times New Roman" w:hAnsi="Times New Roman"/>
+                <w:color w:val="000000"/>
+                <w:sz w:val="20"/>
+              </w:rPr>
+              <w:t>Màn hình Bếp KDS: Đếm giờ món, 'Đang làm'/'Xong'</w:t>
+            </w:r>
+          </w:p>
+        </w:tc>
+        <w:tc>
+          <w:tcPr>
+            <w:tcW w:type="dxa" w:w="2351"/>
+          </w:tcPr>
+          <w:p>
+            <w:pPr>
+              <w:spacing w:line="288" w:lineRule="auto" w:after="40"/>
+              <w:jc w:val="center"/>
+            </w:pPr>
+            <w:r>
+              <w:rPr>
+                <w:rFonts w:ascii="Times New Roman" w:hAnsi="Times New Roman"/>
+                <w:b/>
+                <w:color w:val="000000"/>
+                <w:sz w:val="20"/>
+              </w:rPr>
+              <w:t>Thành viên 3 (Collab B)</w:t>
+            </w:r>
+          </w:p>
+        </w:tc>
+      </w:tr>
+    </w:tbl>
+    <w:p>
+      <w:pPr>
+        <w:spacing w:line="360" w:lineRule="auto" w:after="120"/>
+        <w:jc w:val="both"/>
+      </w:pPr>
+      <w:r>
+        <w:rPr>
+          <w:rFonts w:ascii="Times New Roman" w:hAnsi="Times New Roman"/>
+          <w:b w:val="0"/>
+          <w:i w:val="0"/>
+          <w:color w:val="000000"/>
+          <w:sz w:val="26"/>
+        </w:rPr>
+      </w:r>
+    </w:p>
+    <w:p>
+      <w:pPr>
+        <w:spacing w:line="360" w:lineRule="auto" w:before="200" w:after="80"/>
+      </w:pPr>
+      <w:r>
+        <w:rPr>
+          <w:rFonts w:ascii="Times New Roman" w:hAnsi="Times New Roman"/>
+          <w:b/>
+          <w:color w:val="000000"/>
+          <w:sz w:val="28"/>
+        </w:rPr>
+        <w:t>4.3. Kịch Bản Bảo Vệ Đồ Án Trước Giảng Viên (Defense Strategy)</w:t>
+      </w:r>
+    </w:p>
+    <w:p>
+      <w:pPr>
+        <w:spacing w:line="360" w:lineRule="auto" w:after="120"/>
+        <w:jc w:val="both"/>
+      </w:pPr>
+      <w:r>
+        <w:rPr>
+          <w:rFonts w:ascii="Times New Roman" w:hAnsi="Times New Roman"/>
+          <w:b w:val="0"/>
+          <w:i w:val="0"/>
+          <w:color w:val="000000"/>
+          <w:sz w:val="26"/>
+        </w:rPr>
+        <w:t>Khi báo cáo trước hội đồng chấm thi, mỗi thành viên đại diện trình bày đúng phân hệ do mình trực tiếp phụ trách:</w:t>
+        <w:br/>
+        <w:t>1. Thành viên 1 (Bạn): Báo cáo thiết kế CSDL 10 bảng, 10 lần tự phản biện, kiến trúc Base Provider/Repository chuẩn của thầy, demo Sơ đồ bàn ăn và cơ chế đồng bộ ngoại tuyến SQLite.</w:t>
+        <w:br/>
+        <w:t>2. Thành viên 2 (Collab A): Báo cáo và demo Quản trị Danh mục &amp; Món ăn, cơ chế Upload ảnh 3 trường hợp, demo tính năng chặn xóa khi có ràng buộc, demo Trang chủ phân trang và Giỏ hàng SQLite.</w:t>
+        <w:br/>
+        <w:t>3. Thành viên 3 (Collab B): Báo cáo và demo Xác thực tài khoản, băm mật khẩu, phân quyền Role, quy trình Đặt hàng đẩy sang Màn hình Bếp KDS và demo quét mã VietQR ngân hàng thực tế.</w:t>
       </w:r>
     </w:p>
     <w:p>

</xml_diff>